<commit_message>
added new hypotheses to proposal, deleted unnecessary document
</commit_message>
<xml_diff>
--- a/proposal/BA_MoritzBeyn_firstnotes.docx
+++ b/proposal/BA_MoritzBeyn_firstnotes.docx
@@ -112,6 +112,24 @@
       <w:pPr>
         <w:pStyle w:val="StandardohneAbstand"/>
         <w:rPr>
+          <w:b/>
+          <w:bCs/>
+          <w:lang w:val="en-US"/>
+        </w:rPr>
+      </w:pPr>
+      <w:r>
+        <w:rPr>
+          <w:b/>
+          <w:bCs/>
+          <w:lang w:val="en-US"/>
+        </w:rPr>
+        <w:t>Hypothesis 1</w:t>
+      </w:r>
+    </w:p>
+    <w:p>
+      <w:pPr>
+        <w:pStyle w:val="StandardohneAbstand"/>
+        <w:rPr>
           <w:lang w:val="en-US"/>
         </w:rPr>
       </w:pPr>
@@ -144,27 +162,33 @@
         <w:rPr>
           <w:lang w:val="en-US"/>
         </w:rPr>
-        <w:t xml:space="preserve"> Across all analyzed elections, parties with less than 10% canton-wide vote share receive no more than 5% more seats under the double-proportional </w:t>
+        <w:t xml:space="preserve"> </w:t>
+      </w:r>
+      <w:r>
+        <w:t xml:space="preserve">Across all </w:t>
       </w:r>
       <w:proofErr w:type="spellStart"/>
       <w:r>
-        <w:rPr>
-          <w:lang w:val="en-US"/>
-        </w:rPr>
+        <w:t>analyzed</w:t>
+      </w:r>
+      <w:proofErr w:type="spellEnd"/>
+      <w:r>
+        <w:t xml:space="preserve"> elections, parties with less than 10% canton-wide vote share receive no more than 5% more seats in aggregate under the double-proportional </w:t>
+      </w:r>
+      <w:proofErr w:type="spellStart"/>
+      <w:r>
         <w:t>Pukelsheim</w:t>
       </w:r>
       <w:proofErr w:type="spellEnd"/>
       <w:r>
-        <w:rPr>
-          <w:lang w:val="en-US"/>
-        </w:rPr>
-        <w:t xml:space="preserve"> system than they would have received under Hagenbach-Bischoff.</w:t>
+        <w:t xml:space="preserve"> system than they would have received under a counterfactual Hagenbach-Bischoff allocation.</w:t>
       </w:r>
     </w:p>
     <w:p>
       <w:pPr>
         <w:pStyle w:val="StandardohneAbstand"/>
         <w:rPr>
+          <w:rFonts w:eastAsiaTheme="minorEastAsia"/>
           <w:lang w:val="de-CH"/>
         </w:rPr>
       </w:pPr>
@@ -303,6 +327,14 @@
       <w:pPr>
         <w:pStyle w:val="StandardohneAbstand"/>
         <w:rPr>
+          <w:lang w:val="de-CH"/>
+        </w:rPr>
+      </w:pPr>
+    </w:p>
+    <w:p>
+      <w:pPr>
+        <w:pStyle w:val="StandardohneAbstand"/>
+        <w:rPr>
           <w:lang w:val="en-US"/>
         </w:rPr>
       </w:pPr>
@@ -320,7 +352,7 @@
           <w:bCs/>
           <w:lang w:val="en-US"/>
         </w:rPr>
-        <w:t xml:space="preserve"> (Main)</w:t>
+        <w:t xml:space="preserve"> (Main</w:t>
       </w:r>
       <w:r>
         <w:rPr>
@@ -328,13 +360,53 @@
           <w:bCs/>
           <w:lang w:val="en-US"/>
         </w:rPr>
+        <w:t xml:space="preserve"> Hypothesis</w:t>
+      </w:r>
+      <w:r>
+        <w:rPr>
+          <w:b/>
+          <w:bCs/>
+          <w:lang w:val="en-US"/>
+        </w:rPr>
+        <w:t>)</w:t>
+      </w:r>
+      <w:r>
+        <w:rPr>
+          <w:b/>
+          <w:bCs/>
+          <w:lang w:val="en-US"/>
+        </w:rPr>
         <w:t>:</w:t>
       </w:r>
       <w:r>
         <w:rPr>
           <w:lang w:val="en-US"/>
         </w:rPr>
-        <w:t xml:space="preserve"> Across all analyzed elections, parties with less than 10% canton-wide vote share receive more than 5% more seats under the double-proportional </w:t>
+        <w:t xml:space="preserve"> Across all analyzed elections, parties with less than 10% canton-wide vote share receive more than 5% more seats </w:t>
+      </w:r>
+      <w:r>
+        <w:rPr>
+          <w:lang w:val="en-US"/>
+        </w:rPr>
+        <w:t>in a</w:t>
+      </w:r>
+      <w:r>
+        <w:rPr>
+          <w:lang w:val="en-US"/>
+        </w:rPr>
+        <w:t>ggregate</w:t>
+      </w:r>
+      <w:r>
+        <w:rPr>
+          <w:lang w:val="en-US"/>
+        </w:rPr>
+        <w:t xml:space="preserve"> </w:t>
+      </w:r>
+      <w:r>
+        <w:rPr>
+          <w:lang w:val="en-US"/>
+        </w:rPr>
+        <w:t xml:space="preserve">under the double-proportional </w:t>
       </w:r>
       <w:proofErr w:type="spellStart"/>
       <w:r>
@@ -494,10 +566,37 @@
       <w:pPr>
         <w:pStyle w:val="StandardohneAbstand"/>
         <w:rPr>
-          <w:iCs/>
-          <w:lang w:val="de-CH"/>
-        </w:rPr>
-      </w:pPr>
+          <w:b/>
+          <w:bCs/>
+          <w:lang w:val="en-US"/>
+        </w:rPr>
+      </w:pPr>
+      <w:r>
+        <w:rPr>
+          <w:b/>
+          <w:bCs/>
+          <w:lang w:val="en-US"/>
+        </w:rPr>
+        <w:t>Hypothesis 2</w:t>
+      </w:r>
+    </w:p>
+    <w:p>
+      <w:pPr>
+        <w:pStyle w:val="StandardohneAbstand"/>
+        <w:rPr>
+          <w:b/>
+          <w:bCs/>
+          <w:lang w:val="en-US"/>
+        </w:rPr>
+      </w:pPr>
+      <w:r>
+        <w:rPr>
+          <w:b/>
+          <w:bCs/>
+          <w:lang w:val="en-US"/>
+        </w:rPr>
+        <w:t>Option A</w:t>
+      </w:r>
     </w:p>
     <w:p>
       <w:pPr>
@@ -521,7 +620,7 @@
           <w:vertAlign w:val="subscript"/>
           <w:lang w:val="en-US"/>
         </w:rPr>
-        <w:t>2</w:t>
+        <w:t>2a</w:t>
       </w:r>
       <w:r>
         <w:rPr>
@@ -529,60 +628,340 @@
           <w:bCs/>
           <w:lang w:val="en-US"/>
         </w:rPr>
-        <w:t>:</w:t>
-      </w:r>
-      <w:r>
-        <w:rPr>
-          <w:lang w:val="en-US"/>
-        </w:rPr>
-        <w:t xml:space="preserve"> Across the analyzed regions, party-system fragmentation did not increase between the earlier and later elections.</w:t>
+        <w:t xml:space="preserve"> :</w:t>
+      </w:r>
+      <w:r>
+        <w:rPr>
+          <w:lang w:val="en-US"/>
+        </w:rPr>
+        <w:t xml:space="preserve">The transition to the double </w:t>
+      </w:r>
+      <w:proofErr w:type="spellStart"/>
+      <w:r>
+        <w:rPr>
+          <w:lang w:val="en-US"/>
+        </w:rPr>
+        <w:t>Pukelsheim</w:t>
+      </w:r>
+      <w:proofErr w:type="spellEnd"/>
+      <w:r>
+        <w:rPr>
+          <w:lang w:val="en-US"/>
+        </w:rPr>
+        <w:t xml:space="preserve"> system did not lead to a systematic increase in party-system fragmentation.</w:t>
       </w:r>
     </w:p>
     <w:p>
       <w:pPr>
         <w:pStyle w:val="StandardohneAbstand"/>
+        <w:rPr>
+          <w:i/>
+          <w:lang w:val="de-CH"/>
+        </w:rPr>
+      </w:pPr>
+      <m:oMathPara>
+        <m:oMath>
+          <m:sSub>
+            <m:sSubPr>
+              <m:ctrlPr>
+                <w:rPr>
+                  <w:rFonts w:ascii="Cambria Math" w:hAnsi="Cambria Math"/>
+                  <w:lang w:val="de-CH"/>
+                </w:rPr>
+              </m:ctrlPr>
+            </m:sSubPr>
+            <m:e>
+              <m:r>
+                <w:rPr>
+                  <w:rFonts w:ascii="Cambria Math" w:hAnsi="Cambria Math"/>
+                  <w:lang w:val="de-CH"/>
+                </w:rPr>
+                <m:t>H</m:t>
+              </m:r>
+            </m:e>
+            <m:sub>
+              <m:r>
+                <w:rPr>
+                  <w:rFonts w:ascii="Cambria Math" w:hAnsi="Cambria Math"/>
+                  <w:lang w:val="de-CH"/>
+                </w:rPr>
+                <m:t>0,2</m:t>
+              </m:r>
+            </m:sub>
+          </m:sSub>
+          <m:r>
+            <w:rPr>
+              <w:rFonts w:ascii="Cambria Math" w:hAnsi="Cambria Math"/>
+              <w:lang w:val="de-CH"/>
+            </w:rPr>
+            <m:t>:EN</m:t>
+          </m:r>
+          <m:sSub>
+            <m:sSubPr>
+              <m:ctrlPr>
+                <w:rPr>
+                  <w:rFonts w:ascii="Cambria Math" w:hAnsi="Cambria Math"/>
+                  <w:lang w:val="de-CH"/>
+                </w:rPr>
+              </m:ctrlPr>
+            </m:sSubPr>
+            <m:e>
+              <m:r>
+                <w:rPr>
+                  <w:rFonts w:ascii="Cambria Math" w:hAnsi="Cambria Math"/>
+                  <w:lang w:val="de-CH"/>
+                </w:rPr>
+                <m:t>P</m:t>
+              </m:r>
+            </m:e>
+            <m:sub>
+              <m:r>
+                <w:rPr>
+                  <w:rFonts w:ascii="Cambria Math" w:hAnsi="Cambria Math"/>
+                  <w:lang w:val="de-CH"/>
+                </w:rPr>
+                <m:t>post</m:t>
+              </m:r>
+            </m:sub>
+          </m:sSub>
+          <m:r>
+            <w:rPr>
+              <w:rFonts w:ascii="Cambria Math" w:hAnsi="Cambria Math"/>
+              <w:lang w:val="de-CH"/>
+            </w:rPr>
+            <m:t>-EN</m:t>
+          </m:r>
+          <m:sSub>
+            <m:sSubPr>
+              <m:ctrlPr>
+                <w:rPr>
+                  <w:rFonts w:ascii="Cambria Math" w:hAnsi="Cambria Math"/>
+                  <w:lang w:val="de-CH"/>
+                </w:rPr>
+              </m:ctrlPr>
+            </m:sSubPr>
+            <m:e>
+              <m:r>
+                <w:rPr>
+                  <w:rFonts w:ascii="Cambria Math" w:hAnsi="Cambria Math"/>
+                  <w:lang w:val="de-CH"/>
+                </w:rPr>
+                <m:t>P</m:t>
+              </m:r>
+            </m:e>
+            <m:sub>
+              <m:r>
+                <w:rPr>
+                  <w:rFonts w:ascii="Cambria Math" w:hAnsi="Cambria Math"/>
+                  <w:lang w:val="de-CH"/>
+                </w:rPr>
+                <m:t>pre</m:t>
+              </m:r>
+            </m:sub>
+          </m:sSub>
+          <m:r>
+            <w:rPr>
+              <w:rFonts w:ascii="Cambria Math" w:hAnsi="Cambria Math"/>
+              <w:lang w:val="de-CH"/>
+            </w:rPr>
+            <m:t>≤0</m:t>
+          </m:r>
+        </m:oMath>
+      </m:oMathPara>
+    </w:p>
+    <w:p>
+      <w:pPr>
+        <w:pStyle w:val="StandardohneAbstand"/>
+        <w:rPr>
+          <w:lang w:val="de-CH"/>
+        </w:rPr>
+      </w:pPr>
+    </w:p>
+    <w:p>
+      <w:pPr>
+        <w:pStyle w:val="StandardohneAbstand"/>
+        <w:rPr>
+          <w:lang w:val="en-US"/>
+        </w:rPr>
+      </w:pPr>
+      <w:r>
         <w:rPr>
           <w:b/>
           <w:bCs/>
           <w:lang w:val="en-US"/>
         </w:rPr>
-      </w:pPr>
-    </w:p>
-    <w:p>
-      <w:pPr>
-        <w:pStyle w:val="StandardohneAbstand"/>
-        <w:rPr>
-          <w:lang w:val="en-US"/>
-        </w:rPr>
-      </w:pPr>
+        <w:t>H1₂</w:t>
+      </w:r>
       <w:r>
         <w:rPr>
           <w:b/>
           <w:bCs/>
-          <w:lang w:val="en-US"/>
-        </w:rPr>
-        <w:t>H2:</w:t>
-      </w:r>
-      <w:r>
-        <w:rPr>
-          <w:lang w:val="en-US"/>
-        </w:rPr>
-        <w:t xml:space="preserve"> Across the analyzed regions, party-system fragmentation increased between the earlier and later elections</w:t>
-      </w:r>
-      <w:r>
-        <w:rPr>
-          <w:lang w:val="en-US"/>
-        </w:rPr>
-        <w:t>.</w:t>
+          <w:vertAlign w:val="subscript"/>
+          <w:lang w:val="en-US"/>
+        </w:rPr>
+        <w:t>a</w:t>
+      </w:r>
+      <w:r>
+        <w:rPr>
+          <w:lang w:val="en-US"/>
+        </w:rPr>
+        <w:t xml:space="preserve">The transition to the double </w:t>
+      </w:r>
+      <w:proofErr w:type="spellStart"/>
+      <w:r>
+        <w:rPr>
+          <w:lang w:val="en-US"/>
+        </w:rPr>
+        <w:t>Pukelsheim</w:t>
+      </w:r>
+      <w:proofErr w:type="spellEnd"/>
+      <w:r>
+        <w:rPr>
+          <w:lang w:val="en-US"/>
+        </w:rPr>
+        <w:t xml:space="preserve"> system led to a systematic increase in party-system fragmentation.</w:t>
       </w:r>
     </w:p>
     <w:p>
       <w:pPr>
         <w:pStyle w:val="StandardohneAbstand"/>
         <w:rPr>
-          <w:rFonts w:eastAsiaTheme="minorEastAsia"/>
-          <w:lang w:val="en-US"/>
-        </w:rPr>
+          <w:i/>
+          <w:lang w:val="en-US"/>
+        </w:rPr>
+      </w:pPr>
+      <m:oMathPara>
+        <m:oMath>
+          <m:sSub>
+            <m:sSubPr>
+              <m:ctrlPr>
+                <w:rPr>
+                  <w:rFonts w:ascii="Cambria Math" w:hAnsi="Cambria Math"/>
+                  <w:lang w:val="de-CH"/>
+                </w:rPr>
+              </m:ctrlPr>
+            </m:sSubPr>
+            <m:e>
+              <m:r>
+                <w:rPr>
+                  <w:rFonts w:ascii="Cambria Math" w:hAnsi="Cambria Math"/>
+                  <w:lang w:val="de-CH"/>
+                </w:rPr>
+                <m:t>H</m:t>
+              </m:r>
+            </m:e>
+            <m:sub>
+              <m:r>
+                <w:rPr>
+                  <w:rFonts w:ascii="Cambria Math" w:hAnsi="Cambria Math"/>
+                  <w:lang w:val="en-US"/>
+                </w:rPr>
+                <m:t>1,2</m:t>
+              </m:r>
+            </m:sub>
+          </m:sSub>
+          <m:r>
+            <w:rPr>
+              <w:rFonts w:ascii="Cambria Math" w:hAnsi="Cambria Math"/>
+              <w:lang w:val="en-US"/>
+            </w:rPr>
+            <m:t>:</m:t>
+          </m:r>
+          <m:r>
+            <w:rPr>
+              <w:rFonts w:ascii="Cambria Math" w:hAnsi="Cambria Math"/>
+              <w:lang w:val="de-CH"/>
+            </w:rPr>
+            <m:t>EN</m:t>
+          </m:r>
+          <m:sSub>
+            <m:sSubPr>
+              <m:ctrlPr>
+                <w:rPr>
+                  <w:rFonts w:ascii="Cambria Math" w:hAnsi="Cambria Math"/>
+                  <w:lang w:val="de-CH"/>
+                </w:rPr>
+              </m:ctrlPr>
+            </m:sSubPr>
+            <m:e>
+              <m:r>
+                <w:rPr>
+                  <w:rFonts w:ascii="Cambria Math" w:hAnsi="Cambria Math"/>
+                  <w:lang w:val="de-CH"/>
+                </w:rPr>
+                <m:t>P</m:t>
+              </m:r>
+            </m:e>
+            <m:sub>
+              <m:r>
+                <w:rPr>
+                  <w:rFonts w:ascii="Cambria Math" w:hAnsi="Cambria Math"/>
+                  <w:lang w:val="de-CH"/>
+                </w:rPr>
+                <m:t>post</m:t>
+              </m:r>
+            </m:sub>
+          </m:sSub>
+          <m:r>
+            <w:rPr>
+              <w:rFonts w:ascii="Cambria Math" w:hAnsi="Cambria Math"/>
+              <w:lang w:val="en-US"/>
+            </w:rPr>
+            <m:t>-</m:t>
+          </m:r>
+          <m:r>
+            <w:rPr>
+              <w:rFonts w:ascii="Cambria Math" w:hAnsi="Cambria Math"/>
+              <w:lang w:val="de-CH"/>
+            </w:rPr>
+            <m:t>EN</m:t>
+          </m:r>
+          <m:sSub>
+            <m:sSubPr>
+              <m:ctrlPr>
+                <w:rPr>
+                  <w:rFonts w:ascii="Cambria Math" w:hAnsi="Cambria Math"/>
+                  <w:lang w:val="de-CH"/>
+                </w:rPr>
+              </m:ctrlPr>
+            </m:sSubPr>
+            <m:e>
+              <m:r>
+                <w:rPr>
+                  <w:rFonts w:ascii="Cambria Math" w:hAnsi="Cambria Math"/>
+                  <w:lang w:val="de-CH"/>
+                </w:rPr>
+                <m:t>P</m:t>
+              </m:r>
+            </m:e>
+            <m:sub>
+              <m:r>
+                <w:rPr>
+                  <w:rFonts w:ascii="Cambria Math" w:hAnsi="Cambria Math"/>
+                  <w:lang w:val="de-CH"/>
+                </w:rPr>
+                <m:t>pre</m:t>
+              </m:r>
+            </m:sub>
+          </m:sSub>
+          <m:r>
+            <w:rPr>
+              <w:rFonts w:ascii="Cambria Math" w:hAnsi="Cambria Math"/>
+              <w:lang w:val="en-US"/>
+            </w:rPr>
+            <m:t>&gt;0</m:t>
+          </m:r>
+        </m:oMath>
+      </m:oMathPara>
+    </w:p>
+    <w:p>
+      <w:pPr>
+        <w:pStyle w:val="StandardohneAbstand"/>
+      </w:pPr>
+    </w:p>
+    <w:p>
+      <w:pPr>
+        <w:pStyle w:val="StandardohneAbstand"/>
       </w:pPr>
       <m:oMathPara>
         <m:oMath>
@@ -591,7 +970,21 @@
               <w:rFonts w:ascii="Cambria Math" w:eastAsiaTheme="minorEastAsia" w:hAnsi="Cambria Math"/>
               <w:lang w:val="en-US"/>
             </w:rPr>
-            <m:t>ENP=</m:t>
+            <m:t>ENP</m:t>
+          </m:r>
+          <m:r>
+            <w:rPr>
+              <w:rFonts w:ascii="Cambria Math" w:eastAsiaTheme="minorEastAsia" w:hAnsi="Cambria Math"/>
+              <w:lang w:val="en-US"/>
+            </w:rPr>
+            <m:t>v</m:t>
+          </m:r>
+          <m:r>
+            <w:rPr>
+              <w:rFonts w:ascii="Cambria Math" w:eastAsiaTheme="minorEastAsia" w:hAnsi="Cambria Math"/>
+              <w:lang w:val="en-US"/>
+            </w:rPr>
+            <m:t>=</m:t>
           </m:r>
           <m:f>
             <m:fPr>
@@ -685,96 +1078,33 @@
               </m:nary>
             </m:den>
           </m:f>
-        </m:oMath>
-      </m:oMathPara>
-    </w:p>
-    <w:p>
-      <w:pPr>
-        <w:pStyle w:val="StandardohneAbstand"/>
-        <w:rPr>
-          <w:rFonts w:eastAsiaTheme="minorEastAsia"/>
-          <w:i/>
-          <w:iCs/>
-          <w:lang w:val="en-US"/>
-        </w:rPr>
-      </w:pPr>
-      <w:r>
-        <w:rPr>
-          <w:rFonts w:eastAsiaTheme="minorEastAsia"/>
-          <w:i/>
-          <w:iCs/>
-          <w:lang w:val="en-US"/>
-        </w:rPr>
-        <w:t xml:space="preserve">v </w:t>
-      </w:r>
-      <w:r>
-        <w:rPr>
-          <w:rFonts w:eastAsiaTheme="minorEastAsia"/>
-          <w:i/>
-          <w:iCs/>
-          <w:lang w:val="en-US"/>
-        </w:rPr>
-        <w:t>stands for</w:t>
-      </w:r>
-      <w:r>
-        <w:rPr>
-          <w:rFonts w:eastAsiaTheme="minorEastAsia"/>
-          <w:i/>
-          <w:iCs/>
-          <w:lang w:val="en-US"/>
-        </w:rPr>
-        <w:t xml:space="preserve"> vote</w:t>
-      </w:r>
-      <w:r>
-        <w:rPr>
-          <w:rFonts w:eastAsiaTheme="minorEastAsia"/>
-          <w:i/>
-          <w:iCs/>
-          <w:lang w:val="en-US"/>
-        </w:rPr>
-        <w:t xml:space="preserve"> shares of the parties</w:t>
-      </w:r>
-    </w:p>
-    <w:p>
-      <w:pPr>
-        <w:pStyle w:val="StandardohneAbstand"/>
-        <w:rPr>
-          <w:rFonts w:eastAsiaTheme="minorEastAsia"/>
-          <w:lang w:val="en-US"/>
-        </w:rPr>
-      </w:pPr>
-    </w:p>
-    <w:p>
-      <w:pPr>
-        <w:pStyle w:val="StandardohneAbstand"/>
-        <w:rPr>
-          <w:rFonts w:ascii="Cambria Math" w:eastAsiaTheme="minorEastAsia" w:hAnsi="Cambria Math"/>
-          <w:i/>
-          <w:lang w:val="en-US"/>
-        </w:rPr>
-      </w:pPr>
-      <w:r>
-        <w:rPr>
-          <w:rFonts w:eastAsiaTheme="minorEastAsia"/>
-          <w:lang w:val="en-US"/>
-        </w:rPr>
-        <w:t>for control we also check the proportionality</w:t>
-      </w:r>
-      <w:r>
-        <w:rPr>
-          <w:rFonts w:eastAsiaTheme="minorEastAsia"/>
-          <w:lang w:val="en-US"/>
-        </w:rPr>
-        <w:br/>
-      </w:r>
-      <m:oMathPara>
-        <m:oMath>
           <m:r>
             <w:rPr>
               <w:rFonts w:ascii="Cambria Math" w:eastAsiaTheme="minorEastAsia" w:hAnsi="Cambria Math"/>
               <w:lang w:val="en-US"/>
             </w:rPr>
-            <m:t>ENP=</m:t>
+            <m:t xml:space="preserve">  </m:t>
+          </m:r>
+          <m:r>
+            <w:rPr>
+              <w:rFonts w:ascii="Cambria Math" w:eastAsiaTheme="minorEastAsia" w:hAnsi="Cambria Math"/>
+              <w:lang w:val="en-US"/>
+            </w:rPr>
+            <m:t>ENP</m:t>
+          </m:r>
+          <m:r>
+            <w:rPr>
+              <w:rFonts w:ascii="Cambria Math" w:eastAsiaTheme="minorEastAsia" w:hAnsi="Cambria Math"/>
+              <w:lang w:val="en-US"/>
+            </w:rPr>
+            <m:t>s</m:t>
+          </m:r>
+          <m:r>
+            <w:rPr>
+              <w:rFonts w:ascii="Cambria Math" w:eastAsiaTheme="minorEastAsia" w:hAnsi="Cambria Math"/>
+              <w:lang w:val="en-US"/>
+            </w:rPr>
+            <m:t>=</m:t>
           </m:r>
           <m:f>
             <m:fPr>
@@ -888,18 +1218,197 @@
           <w:iCs/>
           <w:lang w:val="en-US"/>
         </w:rPr>
-        <w:t>s stands for seat shares of the parties</w:t>
-      </w:r>
-    </w:p>
-    <w:p>
-      <w:pPr>
-        <w:pStyle w:val="StandardohneAbstand"/>
+        <w:t xml:space="preserve">v </w:t>
+      </w:r>
+      <w:r>
         <w:rPr>
           <w:rFonts w:eastAsiaTheme="minorEastAsia"/>
           <w:i/>
           <w:iCs/>
           <w:lang w:val="en-US"/>
         </w:rPr>
+        <w:t>= votes shares, s = seat shares</w:t>
+      </w:r>
+    </w:p>
+    <w:p>
+      <w:pPr>
+        <w:pStyle w:val="StandardohneAbstand"/>
+        <w:rPr>
+          <w:rFonts w:eastAsiaTheme="minorEastAsia"/>
+          <w:lang w:val="en-US"/>
+        </w:rPr>
+      </w:pPr>
+    </w:p>
+    <w:p>
+      <w:pPr>
+        <w:pStyle w:val="StandardohneAbstand"/>
+        <w:rPr>
+          <w:rFonts w:eastAsiaTheme="minorEastAsia"/>
+          <w:b/>
+          <w:bCs/>
+          <w:lang w:val="en-US"/>
+        </w:rPr>
+      </w:pPr>
+      <w:r>
+        <w:rPr>
+          <w:rFonts w:eastAsiaTheme="minorEastAsia"/>
+          <w:b/>
+          <w:bCs/>
+          <w:lang w:val="en-US"/>
+        </w:rPr>
+        <w:t>Option B</w:t>
+      </w:r>
+      <w:r>
+        <w:rPr>
+          <w:rFonts w:eastAsiaTheme="minorEastAsia"/>
+          <w:b/>
+          <w:bCs/>
+          <w:lang w:val="en-US"/>
+        </w:rPr>
+        <w:t xml:space="preserve"> </w:t>
+      </w:r>
+    </w:p>
+    <w:p>
+      <w:pPr>
+        <w:pStyle w:val="StandardohneAbstand"/>
+        <w:rPr>
+          <w:rFonts w:eastAsiaTheme="minorEastAsia"/>
+          <w:lang w:val="en-US"/>
+        </w:rPr>
+      </w:pPr>
+      <w:r>
+        <w:rPr>
+          <w:rFonts w:eastAsiaTheme="minorEastAsia"/>
+          <w:b/>
+          <w:bCs/>
+          <w:lang w:val="en-US"/>
+        </w:rPr>
+        <w:t>H0₂</w:t>
+      </w:r>
+      <w:r>
+        <w:rPr>
+          <w:rFonts w:eastAsiaTheme="minorEastAsia"/>
+          <w:b/>
+          <w:bCs/>
+          <w:vertAlign w:val="subscript"/>
+          <w:lang w:val="en-US"/>
+        </w:rPr>
+        <w:t>b</w:t>
+      </w:r>
+      <w:r>
+        <w:rPr>
+          <w:rFonts w:eastAsiaTheme="minorEastAsia"/>
+          <w:b/>
+          <w:bCs/>
+          <w:vertAlign w:val="subscript"/>
+          <w:lang w:val="en-US"/>
+        </w:rPr>
+        <w:t>:</w:t>
+      </w:r>
+      <w:r>
+        <w:rPr>
+          <w:rFonts w:eastAsiaTheme="minorEastAsia"/>
+          <w:lang w:val="en-US"/>
+        </w:rPr>
+        <w:t xml:space="preserve">The double </w:t>
+      </w:r>
+      <w:proofErr w:type="spellStart"/>
+      <w:r>
+        <w:rPr>
+          <w:rFonts w:eastAsiaTheme="minorEastAsia"/>
+          <w:lang w:val="en-US"/>
+        </w:rPr>
+        <w:t>Pukelsheim</w:t>
+      </w:r>
+      <w:proofErr w:type="spellEnd"/>
+      <w:r>
+        <w:rPr>
+          <w:rFonts w:eastAsiaTheme="minorEastAsia"/>
+          <w:lang w:val="en-US"/>
+        </w:rPr>
+        <w:t xml:space="preserve"> system does not mechanically increase parliamentary seat fragmentation compared with the counterfactual Hagenbach-Bischoff allocation.</w:t>
+      </w:r>
+    </w:p>
+    <w:p>
+      <w:pPr>
+        <w:pStyle w:val="StandardohneAbstand"/>
+        <w:rPr>
+          <w:rFonts w:eastAsiaTheme="minorEastAsia"/>
+          <w:b/>
+          <w:bCs/>
+          <w:lang w:val="en-US"/>
+        </w:rPr>
+      </w:pPr>
+    </w:p>
+    <w:p>
+      <w:pPr>
+        <w:pStyle w:val="StandardohneAbstand"/>
+        <w:rPr>
+          <w:rFonts w:eastAsiaTheme="minorEastAsia"/>
+          <w:lang w:val="en-US"/>
+        </w:rPr>
+      </w:pPr>
+      <w:r>
+        <w:rPr>
+          <w:rFonts w:eastAsiaTheme="minorEastAsia"/>
+          <w:b/>
+          <w:bCs/>
+          <w:lang w:val="en-US"/>
+        </w:rPr>
+        <w:t>H1₂</w:t>
+      </w:r>
+      <w:r>
+        <w:rPr>
+          <w:rFonts w:eastAsiaTheme="minorEastAsia"/>
+          <w:b/>
+          <w:bCs/>
+          <w:vertAlign w:val="subscript"/>
+          <w:lang w:val="en-US"/>
+        </w:rPr>
+        <w:t>b</w:t>
+      </w:r>
+      <w:r>
+        <w:rPr>
+          <w:rFonts w:eastAsiaTheme="minorEastAsia"/>
+          <w:b/>
+          <w:bCs/>
+          <w:lang w:val="en-US"/>
+        </w:rPr>
+        <w:t>:</w:t>
+      </w:r>
+      <w:r>
+        <w:rPr>
+          <w:rFonts w:eastAsiaTheme="minorEastAsia"/>
+          <w:lang w:val="en-US"/>
+        </w:rPr>
+        <w:t xml:space="preserve">The double </w:t>
+      </w:r>
+      <w:proofErr w:type="spellStart"/>
+      <w:r>
+        <w:rPr>
+          <w:rFonts w:eastAsiaTheme="minorEastAsia"/>
+          <w:lang w:val="en-US"/>
+        </w:rPr>
+        <w:t>Pukelsheim</w:t>
+      </w:r>
+      <w:proofErr w:type="spellEnd"/>
+      <w:r>
+        <w:rPr>
+          <w:rFonts w:eastAsiaTheme="minorEastAsia"/>
+          <w:lang w:val="en-US"/>
+        </w:rPr>
+        <w:t xml:space="preserve"> system mechanically increases parliamentary seat fragmentation compared with the counterfactual Hagenbach-Bischoff allocation.</w:t>
+      </w:r>
+    </w:p>
+    <w:p>
+      <w:pPr>
+        <w:pStyle w:val="StandardohneAbstand"/>
+        <w:rPr>
+          <w:rFonts w:eastAsiaTheme="minorEastAsia"/>
+          <w:b/>
+          <w:bCs/>
+          <w:lang w:val="en-US"/>
+        </w:rPr>
       </w:pPr>
     </w:p>
     <w:p>
@@ -907,17 +1416,276 @@
         <w:pStyle w:val="StandardohneAbstand"/>
         <w:jc w:val="center"/>
         <w:rPr>
+          <w:rFonts w:eastAsiaTheme="minorEastAsia"/>
           <w:b/>
           <w:bCs/>
           <w:sz w:val="24"/>
-        </w:rPr>
-      </w:pPr>
-      <w:r>
-        <w:rPr>
+          <w:szCs w:val="24"/>
+          <w:lang w:val="en-US"/>
+        </w:rPr>
+      </w:pPr>
+      <w:r>
+        <w:rPr>
+          <w:rFonts w:eastAsiaTheme="minorEastAsia"/>
           <w:b/>
           <w:bCs/>
           <w:sz w:val="24"/>
-        </w:rPr>
+          <w:szCs w:val="24"/>
+          <w:lang w:val="en-US"/>
+        </w:rPr>
+        <w:t>Summary of The Hypotheses</w:t>
+      </w:r>
+    </w:p>
+    <w:p>
+      <w:pPr>
+        <w:pStyle w:val="StandardohneAbstand"/>
+        <w:rPr>
+          <w:lang w:val="en-US"/>
+        </w:rPr>
+      </w:pPr>
+      <w:r>
+        <w:rPr>
+          <w:lang w:val="en-US"/>
+        </w:rPr>
+        <w:t xml:space="preserve">Based on the literature and the mathematical logic underlying the double </w:t>
+      </w:r>
+      <w:proofErr w:type="spellStart"/>
+      <w:r>
+        <w:rPr>
+          <w:lang w:val="en-US"/>
+        </w:rPr>
+        <w:t>Pukelsheim</w:t>
+      </w:r>
+      <w:proofErr w:type="spellEnd"/>
+      <w:r>
+        <w:rPr>
+          <w:lang w:val="en-US"/>
+        </w:rPr>
+        <w:t xml:space="preserve"> system, this thesis expects seats to be allocated more proportionally than under Hagenbach-Bischoff. As a result,</w:t>
+      </w:r>
+      <w:r>
+        <w:rPr>
+          <w:lang w:val="en-US"/>
+        </w:rPr>
+        <w:t xml:space="preserve"> the threshold lowers. </w:t>
+      </w:r>
+      <w:proofErr w:type="gramStart"/>
+      <w:r>
+        <w:rPr>
+          <w:lang w:val="en-US"/>
+        </w:rPr>
+        <w:t>Therefore</w:t>
+      </w:r>
+      <w:proofErr w:type="gramEnd"/>
+      <w:r>
+        <w:rPr>
+          <w:lang w:val="en-US"/>
+        </w:rPr>
+        <w:t xml:space="preserve"> it’s estimated that</w:t>
+      </w:r>
+      <w:r>
+        <w:rPr>
+          <w:lang w:val="en-US"/>
+        </w:rPr>
+        <w:t xml:space="preserve"> smaller parties, defined as parties with less than 10% of the canton-wide vote share, gain seats under the double </w:t>
+      </w:r>
+      <w:proofErr w:type="spellStart"/>
+      <w:r>
+        <w:rPr>
+          <w:lang w:val="en-US"/>
+        </w:rPr>
+        <w:t>Pukelsheim</w:t>
+      </w:r>
+      <w:proofErr w:type="spellEnd"/>
+      <w:r>
+        <w:rPr>
+          <w:lang w:val="en-US"/>
+        </w:rPr>
+        <w:t xml:space="preserve"> system.</w:t>
+      </w:r>
+      <w:r>
+        <w:rPr>
+          <w:lang w:val="en-US"/>
+        </w:rPr>
+        <w:t xml:space="preserve"> </w:t>
+      </w:r>
+      <w:r>
+        <w:rPr>
+          <w:lang w:val="en-US"/>
+        </w:rPr>
+        <w:t xml:space="preserve">However, this thesis does </w:t>
+      </w:r>
+      <w:proofErr w:type="spellStart"/>
+      <w:r>
+        <w:rPr>
+          <w:lang w:val="en-US"/>
+        </w:rPr>
+        <w:t>n</w:t>
+      </w:r>
+      <w:r>
+        <w:rPr>
+          <w:lang w:val="en-US"/>
+        </w:rPr>
+        <w:t>’</w:t>
+      </w:r>
+      <w:r>
+        <w:rPr>
+          <w:lang w:val="en-US"/>
+        </w:rPr>
+        <w:t>t</w:t>
+      </w:r>
+      <w:proofErr w:type="spellEnd"/>
+      <w:r>
+        <w:rPr>
+          <w:lang w:val="en-US"/>
+        </w:rPr>
+        <w:t xml:space="preserve"> expect to reject</w:t>
+      </w:r>
+      <w:r>
+        <w:rPr>
+          <w:lang w:val="en-US"/>
+        </w:rPr>
+        <w:t xml:space="preserve"> H0</w:t>
+      </w:r>
+      <w:r>
+        <w:rPr>
+          <w:vertAlign w:val="subscript"/>
+          <w:lang w:val="en-US"/>
+        </w:rPr>
+        <w:t>2a</w:t>
+      </w:r>
+      <w:r>
+        <w:rPr>
+          <w:lang w:val="en-US"/>
+        </w:rPr>
+        <w:t xml:space="preserve">. </w:t>
+      </w:r>
+      <w:proofErr w:type="spellStart"/>
+      <w:r>
+        <w:rPr>
+          <w:lang w:val="en-US"/>
+        </w:rPr>
+        <w:t>Lüscher’s</w:t>
+      </w:r>
+      <w:proofErr w:type="spellEnd"/>
+      <w:r>
+        <w:rPr>
+          <w:lang w:val="en-US"/>
+        </w:rPr>
+        <w:t xml:space="preserve"> dissertation</w:t>
+      </w:r>
+      <w:r>
+        <w:rPr>
+          <w:lang w:val="en-US"/>
+        </w:rPr>
+        <w:t xml:space="preserve"> </w:t>
+      </w:r>
+      <w:r>
+        <w:rPr>
+          <w:lang w:val="en-US"/>
+        </w:rPr>
+        <w:t xml:space="preserve">finds no significant increase in the number of parties represented in parliament after the introduction of the double </w:t>
+      </w:r>
+      <w:proofErr w:type="spellStart"/>
+      <w:r>
+        <w:rPr>
+          <w:lang w:val="en-US"/>
+        </w:rPr>
+        <w:t>Pukelsheim</w:t>
+      </w:r>
+      <w:proofErr w:type="spellEnd"/>
+      <w:r>
+        <w:rPr>
+          <w:lang w:val="en-US"/>
+        </w:rPr>
+        <w:t xml:space="preserve"> system</w:t>
+      </w:r>
+      <w:r>
+        <w:rPr>
+          <w:lang w:val="en-US"/>
+        </w:rPr>
+        <w:t xml:space="preserve"> </w:t>
+      </w:r>
+      <w:r>
+        <w:rPr>
+          <w:lang w:val="en-US"/>
+        </w:rPr>
+        <w:t>(Lüscher,2024,p.135)</w:t>
+      </w:r>
+      <w:r>
+        <w:rPr>
+          <w:lang w:val="en-US"/>
+        </w:rPr>
+        <w:t>. Therefore, this thesis expects a similar result: while smaller parties may gain seats mechanically, the reform is not expected to lead to a systematic increase in party-system fragmentation.</w:t>
+      </w:r>
+      <w:r>
+        <w:rPr>
+          <w:lang w:val="en-US"/>
+        </w:rPr>
+        <w:t xml:space="preserve"> On the other hand,</w:t>
+      </w:r>
+      <w:r>
+        <w:rPr>
+          <w:lang w:val="en-US"/>
+        </w:rPr>
+        <w:t>H0</w:t>
+      </w:r>
+      <w:r>
+        <w:rPr>
+          <w:vertAlign w:val="subscript"/>
+          <w:lang w:val="en-US"/>
+        </w:rPr>
+        <w:t xml:space="preserve">2b </w:t>
+      </w:r>
+      <w:r>
+        <w:rPr>
+          <w:lang w:val="en-US"/>
+        </w:rPr>
+        <w:t xml:space="preserve">is expected to be rejected, since </w:t>
+      </w:r>
+      <w:proofErr w:type="spellStart"/>
+      <w:r>
+        <w:t>Pukelsheim</w:t>
+      </w:r>
+      <w:proofErr w:type="spellEnd"/>
+      <w:r>
+        <w:t xml:space="preserve"> should distribute seats more proportionally and reduce concentration among larger parties.</w:t>
+      </w:r>
+    </w:p>
+    <w:p>
+      <w:pPr>
+        <w:rPr>
+          <w:b/>
+          <w:bCs/>
+          <w:sz w:val="24"/>
+        </w:rPr>
+      </w:pPr>
+      <w:r>
+        <w:rPr>
+          <w:b/>
+          <w:bCs/>
+          <w:sz w:val="24"/>
+        </w:rPr>
+        <w:br w:type="page"/>
+      </w:r>
+    </w:p>
+    <w:p>
+      <w:pPr>
+        <w:pStyle w:val="StandardohneAbstand"/>
+        <w:jc w:val="center"/>
+        <w:rPr>
+          <w:b/>
+          <w:bCs/>
+          <w:sz w:val="24"/>
+        </w:rPr>
+      </w:pPr>
+      <w:r>
+        <w:rPr>
+          <w:b/>
+          <w:bCs/>
+          <w:sz w:val="24"/>
+        </w:rPr>
+        <w:lastRenderedPageBreak/>
         <w:t>Topic</w:t>
       </w:r>
     </w:p>
@@ -1036,6 +1804,110 @@
         </w:rPr>
         <w:t>, emerged in this context as a reform intended to reduce such distortions and to strengthen the equal weight of votes across the canton (Lüscher, 2023, p. 571).</w:t>
       </w:r>
+    </w:p>
+    <w:p>
+      <w:pPr>
+        <w:pStyle w:val="StandardohneAbstand"/>
+        <w:rPr>
+          <w:lang w:val="en-US"/>
+        </w:rPr>
+      </w:pPr>
+    </w:p>
+    <w:p>
+      <w:pPr>
+        <w:pStyle w:val="StandardohneAbstand"/>
+        <w:rPr>
+          <w:lang w:val="en-US"/>
+        </w:rPr>
+      </w:pPr>
+      <w:r>
+        <w:rPr>
+          <w:lang w:val="en-US"/>
+        </w:rPr>
+        <w:t>At the core of this debate lies the contrast between two different logics of seat allocation. The traditional Hagenbach-Bischoff method belongs to the family of divisor methods with downward rounding and therefore tends to benefit larger parties, especially in smaller electoral districts</w:t>
+      </w:r>
+      <w:r>
+        <w:rPr>
+          <w:lang w:val="en-US"/>
+        </w:rPr>
+        <w:t>.</w:t>
+      </w:r>
+      <w:r>
+        <w:rPr>
+          <w:lang w:val="en-US"/>
+        </w:rPr>
+        <w:t xml:space="preserve"> (</w:t>
+      </w:r>
+      <w:proofErr w:type="spellStart"/>
+      <w:r>
+        <w:rPr>
+          <w:lang w:val="en-US"/>
+        </w:rPr>
+        <w:t>Bundeskanzlei</w:t>
+      </w:r>
+      <w:proofErr w:type="spellEnd"/>
+      <w:r>
+        <w:rPr>
+          <w:lang w:val="en-US"/>
+        </w:rPr>
+        <w:t xml:space="preserve">, 2013, pp. 6–7). By contrast, the double </w:t>
+      </w:r>
+      <w:proofErr w:type="spellStart"/>
+      <w:r>
+        <w:rPr>
+          <w:lang w:val="en-US"/>
+        </w:rPr>
+        <w:t>Pukelsheim</w:t>
+      </w:r>
+      <w:proofErr w:type="spellEnd"/>
+      <w:r>
+        <w:rPr>
+          <w:lang w:val="en-US"/>
+        </w:rPr>
+        <w:t xml:space="preserve"> combines a canton-wide upper allocation with a subsequent redistribution of seats to districts, thereby improving proportionality at the cantonal level and reducing the number of votes that remain without effective influence on seat allocation (</w:t>
+      </w:r>
+      <w:proofErr w:type="spellStart"/>
+      <w:r>
+        <w:rPr>
+          <w:lang w:val="en-US"/>
+        </w:rPr>
+        <w:t>Pukelsheim</w:t>
+      </w:r>
+      <w:proofErr w:type="spellEnd"/>
+      <w:r>
+        <w:rPr>
+          <w:lang w:val="en-US"/>
+        </w:rPr>
+        <w:t xml:space="preserve"> &amp; Schuhmacher, 2011, pp. 1581–1582, 1591). In this sense, the reform is closely linked to the principle of </w:t>
+      </w:r>
+      <w:proofErr w:type="spellStart"/>
+      <w:r>
+        <w:rPr>
+          <w:lang w:val="en-US"/>
+        </w:rPr>
+        <w:t>Erfolgswertgleichheit</w:t>
+      </w:r>
+      <w:proofErr w:type="spellEnd"/>
+      <w:r>
+        <w:rPr>
+          <w:lang w:val="en-US"/>
+        </w:rPr>
+        <w:t>, meaning that votes should contribute as equally as possible to the final electoral outcome (</w:t>
+      </w:r>
+      <w:proofErr w:type="spellStart"/>
+      <w:r>
+        <w:rPr>
+          <w:lang w:val="en-US"/>
+        </w:rPr>
+        <w:t>Bundeskanzlei</w:t>
+      </w:r>
+      <w:proofErr w:type="spellEnd"/>
+      <w:r>
+        <w:rPr>
+          <w:lang w:val="en-US"/>
+        </w:rPr>
+        <w:t>, 2013, pp. 8–9).</w:t>
+      </w:r>
       <w:r>
         <w:rPr>
           <w:lang w:val="en-US"/>
@@ -1054,109 +1926,6 @@
         <w:rPr>
           <w:lang w:val="en-US"/>
         </w:rPr>
-        <w:t>At the core of this debate lies the contrast between two different logics of seat allocation. The traditional Hagenbach-Bischoff method belongs to the family of divisor methods with downward rounding and therefore tends to benefit larger parties, especially in smaller electoral districts</w:t>
-      </w:r>
-      <w:r>
-        <w:rPr>
-          <w:lang w:val="en-US"/>
-        </w:rPr>
-        <w:t>.</w:t>
-      </w:r>
-      <w:r>
-        <w:rPr>
-          <w:lang w:val="en-US"/>
-        </w:rPr>
-        <w:t xml:space="preserve"> (</w:t>
-      </w:r>
-      <w:proofErr w:type="spellStart"/>
-      <w:r>
-        <w:rPr>
-          <w:lang w:val="en-US"/>
-        </w:rPr>
-        <w:t>Bundeskanzlei</w:t>
-      </w:r>
-      <w:proofErr w:type="spellEnd"/>
-      <w:r>
-        <w:rPr>
-          <w:lang w:val="en-US"/>
-        </w:rPr>
-        <w:t xml:space="preserve">, 2013, pp. 6–7). By contrast, the double </w:t>
-      </w:r>
-      <w:proofErr w:type="spellStart"/>
-      <w:r>
-        <w:rPr>
-          <w:lang w:val="en-US"/>
-        </w:rPr>
-        <w:t>Pukelsheim</w:t>
-      </w:r>
-      <w:proofErr w:type="spellEnd"/>
-      <w:r>
-        <w:rPr>
-          <w:lang w:val="en-US"/>
-        </w:rPr>
-        <w:t xml:space="preserve"> combines a canton-wide upper allocation with a subsequent redistribution of seats to districts, thereby improving proportionality at the cantonal level and reducing the number of votes that remain without effective influence on seat allocation (</w:t>
-      </w:r>
-      <w:proofErr w:type="spellStart"/>
-      <w:r>
-        <w:rPr>
-          <w:lang w:val="en-US"/>
-        </w:rPr>
-        <w:t>Pukelsheim</w:t>
-      </w:r>
-      <w:proofErr w:type="spellEnd"/>
-      <w:r>
-        <w:rPr>
-          <w:lang w:val="en-US"/>
-        </w:rPr>
-        <w:t xml:space="preserve"> &amp; Schuhmacher, 2011, pp. 1581–1582, 1591). In this sense, the reform is closely linked to the principle of </w:t>
-      </w:r>
-      <w:proofErr w:type="spellStart"/>
-      <w:r>
-        <w:rPr>
-          <w:lang w:val="en-US"/>
-        </w:rPr>
-        <w:t>Erfolgswertgleichheit</w:t>
-      </w:r>
-      <w:proofErr w:type="spellEnd"/>
-      <w:r>
-        <w:rPr>
-          <w:lang w:val="en-US"/>
-        </w:rPr>
-        <w:t>, meaning that votes should contribute as equally as possible to the final electoral outcome (</w:t>
-      </w:r>
-      <w:proofErr w:type="spellStart"/>
-      <w:r>
-        <w:rPr>
-          <w:lang w:val="en-US"/>
-        </w:rPr>
-        <w:t>Bundeskanzlei</w:t>
-      </w:r>
-      <w:proofErr w:type="spellEnd"/>
-      <w:r>
-        <w:rPr>
-          <w:lang w:val="en-US"/>
-        </w:rPr>
-        <w:t>, 2013, pp. 8–9).</w:t>
-      </w:r>
-      <w:r>
-        <w:rPr>
-          <w:lang w:val="en-US"/>
-        </w:rPr>
-        <w:br/>
-      </w:r>
-    </w:p>
-    <w:p>
-      <w:pPr>
-        <w:pStyle w:val="StandardohneAbstand"/>
-        <w:rPr>
-          <w:lang w:val="en-US"/>
-        </w:rPr>
-      </w:pPr>
-      <w:r>
-        <w:rPr>
-          <w:lang w:val="en-US"/>
-        </w:rPr>
-        <w:lastRenderedPageBreak/>
         <w:t xml:space="preserve">This reform is especially relevant for the representation of smaller parties. Because the double </w:t>
       </w:r>
       <w:proofErr w:type="spellStart"/>
@@ -2133,7 +2902,6 @@
               <w:rPr>
                 <w:lang w:val="de-CH"/>
               </w:rPr>
-              <w:lastRenderedPageBreak/>
               <w:t>PDF(</w:t>
             </w:r>
             <w:proofErr w:type="gramEnd"/>
@@ -2194,7 +2962,6 @@
               <w:rPr>
                 <w:lang w:val="en-US"/>
               </w:rPr>
-              <w:lastRenderedPageBreak/>
               <w:t>3 | 2016</w:t>
             </w:r>
           </w:p>
@@ -3268,6 +4035,7 @@
               <w:rPr>
                 <w:lang w:val="en-US"/>
               </w:rPr>
+              <w:lastRenderedPageBreak/>
               <w:t>Seats_received_DP</w:t>
             </w:r>
             <w:proofErr w:type="spellEnd"/>
@@ -3563,6 +4331,12 @@
         <w:rPr>
           <w:lang w:val="en-US"/>
         </w:rPr>
+        <w:t xml:space="preserve">H1: </w:t>
+      </w:r>
+      <w:r>
+        <w:rPr>
+          <w:lang w:val="en-US"/>
+        </w:rPr>
         <w:t xml:space="preserve">The analysis takes the actual seat allocation under the </w:t>
       </w:r>
       <w:proofErr w:type="spellStart"/>
@@ -3645,7 +4419,6 @@
         <w:rPr>
           <w:lang w:val="en-US"/>
         </w:rPr>
-        <w:lastRenderedPageBreak/>
         <w:t xml:space="preserve">The choice of 10% as the threshold is grounded in both legal and normative considerations. In its decision BGE 131 I 74, the Swiss Federal Supreme Court argued that direct and natural quorums, understood as barriers to representation within an electoral district, should generally not exceed 10%. The 2013 report of the Federal Chancellery refers to the same benchmark and further notes that the Venice Commission considers thresholds in the range of 10–15% to be the upper acceptable limit. Using vote share rather than absolute party size is particularly appropriate because a party may be electorally small in one region while being comparatively strong in another. Low thresholds are closely linked to the principle of </w:t>
       </w:r>
       <w:proofErr w:type="spellStart"/>
@@ -3692,6 +4465,19 @@
     </w:p>
     <w:p>
       <w:pPr>
+        <w:rPr>
+          <w:lang w:val="en-US"/>
+        </w:rPr>
+      </w:pPr>
+      <w:r>
+        <w:rPr>
+          <w:lang w:val="en-US"/>
+        </w:rPr>
+        <w:t xml:space="preserve">H2: </w:t>
+      </w:r>
+    </w:p>
+    <w:p>
+      <w:pPr>
         <w:jc w:val="center"/>
         <w:rPr>
           <w:b/>
@@ -3718,34 +4504,26 @@
         <w:rPr>
           <w:lang w:val="en-US"/>
         </w:rPr>
-        <w:t xml:space="preserve">To present </w:t>
+        <w:t xml:space="preserve">H1: </w:t>
+      </w:r>
+      <w:r>
+        <w:rPr>
+          <w:lang w:val="en-US"/>
+        </w:rPr>
+        <w:t xml:space="preserve">To present the empirical findings, the thesis will use scatterplots at two levels of analysis. First, for each election, a scatterplot will show how many seats smaller parties </w:t>
       </w:r>
       <w:proofErr w:type="gramStart"/>
       <w:r>
         <w:rPr>
           <w:lang w:val="en-US"/>
         </w:rPr>
-        <w:t>the empirical</w:t>
+        <w:t>actually received</w:t>
       </w:r>
       <w:proofErr w:type="gramEnd"/>
       <w:r>
         <w:rPr>
           <w:lang w:val="en-US"/>
         </w:rPr>
-        <w:t xml:space="preserve"> findings, the thesis will use scatterplots at two levels of analysis. First, for each election, a scatterplot will show how many seats smaller parties </w:t>
-      </w:r>
-      <w:proofErr w:type="gramStart"/>
-      <w:r>
-        <w:rPr>
-          <w:lang w:val="en-US"/>
-        </w:rPr>
-        <w:t>actually received</w:t>
-      </w:r>
-      <w:proofErr w:type="gramEnd"/>
-      <w:r>
-        <w:rPr>
-          <w:lang w:val="en-US"/>
-        </w:rPr>
         <w:t xml:space="preserve"> under the </w:t>
       </w:r>
       <w:proofErr w:type="spellStart"/>
@@ -3788,6 +4566,19 @@
           <w:lang w:val="en-US"/>
         </w:rPr>
         <w:t>Second, these election-level results will be aggregated into an overall comparative scatterplot. In this summary figure, each election will be represented by two data points, one for the old system and one for the new system, combining the outcomes for all smaller parties within that election. This allows for an overall assessment of whether smaller parties benefited from the institutional reform across elections. In addition, the analysis may reveal regional differences, for example whether smaller parties in cantons such as Zurich benefited more strongly from the reform than smaller parties in cantons such as Graubünden. If the scope of the thesis permits, the analysis may also be extended to examine whether the effects vary systematically across specific parties rather than only across elections or cantons.</w:t>
+      </w:r>
+    </w:p>
+    <w:p>
+      <w:pPr>
+        <w:rPr>
+          <w:lang w:val="en-US"/>
+        </w:rPr>
+      </w:pPr>
+      <w:r>
+        <w:rPr>
+          <w:lang w:val="en-US"/>
+        </w:rPr>
+        <w:t xml:space="preserve">H2: </w:t>
       </w:r>
     </w:p>
     <w:p>
@@ -3812,6 +4603,7 @@
           <w:szCs w:val="24"/>
           <w:lang w:val="de-CH"/>
         </w:rPr>
+        <w:lastRenderedPageBreak/>
         <w:t>Literature Review</w:t>
       </w:r>
     </w:p>
@@ -4330,15 +5122,7 @@
           <w:noProof/>
           <w:lang w:val="en-US"/>
         </w:rPr>
-        <w:t xml:space="preserve">and, consequently, the representation of the electorates and parties based in </w:t>
-      </w:r>
-      <w:r>
-        <w:rPr>
-          <w:noProof/>
-          <w:lang w:val="en-US"/>
-        </w:rPr>
-        <w:lastRenderedPageBreak/>
-        <w:t>those constituencies</w:t>
+        <w:t>and, consequently, the representation of the electorates and parties based in those constituencies</w:t>
       </w:r>
       <w:r>
         <w:rPr>
@@ -4446,7 +5230,18 @@
         <w:ind w:left="1134"/>
       </w:pPr>
       <w:r>
-        <w:t>Dissertation at the UZH. The Dissertation is not publicly available, but I wrote an E-Mail to Mr. Lüscher. The Dissertation could possibly be suitable to compare with my calculations and findings.</w:t>
+        <w:t xml:space="preserve">(got Dissertation via Mail contact) The dissertation looked at effects, which in this Thesis will also be discussed. E.g. did it show how for 3 cantons, the seat disproportionality massively dropped through the reform. </w:t>
+      </w:r>
+      <w:r>
+        <w:t xml:space="preserve">Also does it discuss the influence of the reform on party fragmentation. </w:t>
+      </w:r>
+      <w:proofErr w:type="gramStart"/>
+      <w:r>
+        <w:t>Generally</w:t>
+      </w:r>
+      <w:proofErr w:type="gramEnd"/>
+      <w:r>
+        <w:t xml:space="preserve"> it’s a good source, to check consistency of my assumptions.</w:t>
       </w:r>
     </w:p>
     <w:p>
@@ -4655,26 +5450,14 @@
         <w:pStyle w:val="StandardohneAbstand"/>
         <w:ind w:left="1134"/>
         <w:rPr>
-          <w:i/>
-          <w:iCs/>
-          <w:lang w:val="en-US"/>
-        </w:rPr>
-      </w:pPr>
-      <w:r>
-        <w:rPr>
-          <w:i/>
-          <w:iCs/>
-          <w:lang w:val="en-US"/>
-        </w:rPr>
-        <w:t>This Paper can be u</w:t>
-      </w:r>
-      <w:r>
-        <w:rPr>
-          <w:i/>
-          <w:iCs/>
-          <w:lang w:val="en-US"/>
-        </w:rPr>
-        <w:t>sed as a historical document since it explains the process of the inauguration of the new electoral system.</w:t>
+          <w:lang w:val="en-US"/>
+        </w:rPr>
+      </w:pPr>
+      <w:r>
+        <w:rPr>
+          <w:lang w:val="en-US"/>
+        </w:rPr>
+        <w:t>This Paper can be used as a historical document since it explains the process of the inauguration of the new electoral system.</w:t>
       </w:r>
     </w:p>
     <w:p>
@@ -5969,7 +6752,6 @@
   <w:style w:type="character" w:default="1" w:styleId="DefaultParagraphFont">
     <w:name w:val="Default Paragraph Font"/>
     <w:uiPriority w:val="1"/>
-    <w:semiHidden/>
     <w:unhideWhenUsed/>
   </w:style>
   <w:style w:type="table" w:default="1" w:styleId="TableNormal">
@@ -7009,18 +7791,11 @@
 </file>
 
 <file path=customXml/item2.xml><?xml version="1.0" encoding="utf-8"?>
-<b:Sources xmlns:b="http://schemas.openxmlformats.org/officeDocument/2006/bibliography" xmlns="http://schemas.openxmlformats.org/officeDocument/2006/bibliography" SelectedStyle="\APASixthEditionOfficeOnline.xsl" StyleName="APA" Version="6"/>
+<TemplafyTemplateConfiguration><![CDATA[{"elementsMetadata":[],"transformationConfigurations":[{"language":"{{UserProfile.DocumentLanguage.Language}}","disableUpdates":false,"type":"proofingLanguage"},{"propertyName":"creator","propertyValue":"{{UserProfile.FirstName}} {{UserProfile.LastName}}","disableUpdates":false,"type":"documentProperty"}],"templateName":"Blank document","templateDescription":"","enableDocumentContentUpdater":true,"version":"2.0"}]]></TemplafyTemplateConfiguration>
 </file>
 
 <file path=customXml/item3.xml><?xml version="1.0" encoding="utf-8"?>
-<p:properties xmlns:p="http://schemas.microsoft.com/office/2006/metadata/properties" xmlns:xsi="http://www.w3.org/2001/XMLSchema-instance" xmlns:pc="http://schemas.microsoft.com/office/infopath/2007/PartnerControls">
-  <documentManagement>
-    <lcf76f155ced4ddcb4097134ff3c332f xmlns="07c8a24f-8b40-44ca-950f-ae5db2c4fa23">
-      <Terms xmlns="http://schemas.microsoft.com/office/infopath/2007/PartnerControls"/>
-    </lcf76f155ced4ddcb4097134ff3c332f>
-    <TaxCatchAll xmlns="71d337dc-809a-4269-a690-d6cd31b4acd0" xsi:nil="true"/>
-  </documentManagement>
-</p:properties>
+<TemplafyFormConfiguration><![CDATA[{"formFields":[],"formDataEntries":[]}]]></TemplafyFormConfiguration>
 </file>
 
 <file path=customXml/item4.xml><?xml version="1.0" encoding="utf-8"?>
@@ -7267,11 +8042,18 @@
 </file>
 
 <file path=customXml/item5.xml><?xml version="1.0" encoding="utf-8"?>
-<TemplafyFormConfiguration><![CDATA[{"formFields":[],"formDataEntries":[]}]]></TemplafyFormConfiguration>
+<p:properties xmlns:p="http://schemas.microsoft.com/office/2006/metadata/properties" xmlns:xsi="http://www.w3.org/2001/XMLSchema-instance" xmlns:pc="http://schemas.microsoft.com/office/infopath/2007/PartnerControls">
+  <documentManagement>
+    <lcf76f155ced4ddcb4097134ff3c332f xmlns="07c8a24f-8b40-44ca-950f-ae5db2c4fa23">
+      <Terms xmlns="http://schemas.microsoft.com/office/infopath/2007/PartnerControls"/>
+    </lcf76f155ced4ddcb4097134ff3c332f>
+    <TaxCatchAll xmlns="71d337dc-809a-4269-a690-d6cd31b4acd0" xsi:nil="true"/>
+  </documentManagement>
+</p:properties>
 </file>
 
 <file path=customXml/item6.xml><?xml version="1.0" encoding="utf-8"?>
-<TemplafyTemplateConfiguration><![CDATA[{"elementsMetadata":[],"transformationConfigurations":[{"language":"{{UserProfile.DocumentLanguage.Language}}","disableUpdates":false,"type":"proofingLanguage"},{"propertyName":"creator","propertyValue":"{{UserProfile.FirstName}} {{UserProfile.LastName}}","disableUpdates":false,"type":"documentProperty"}],"templateName":"Blank document","templateDescription":"","enableDocumentContentUpdater":true,"version":"2.0"}]]></TemplafyTemplateConfiguration>
+<b:Sources xmlns:b="http://schemas.openxmlformats.org/officeDocument/2006/bibliography" xmlns="http://schemas.openxmlformats.org/officeDocument/2006/bibliography" SelectedStyle="\APASixthEditionOfficeOnline.xsl" StyleName="APA" Version="6"/>
 </file>
 
 <file path=customXml/itemProps1.xml><?xml version="1.0" encoding="utf-8"?>
@@ -7283,21 +8065,14 @@
 </file>
 
 <file path=customXml/itemProps2.xml><?xml version="1.0" encoding="utf-8"?>
-<ds:datastoreItem xmlns:ds="http://schemas.openxmlformats.org/officeDocument/2006/customXml" ds:itemID="{DCA57B62-5710-4DF4-8C56-32AF1ABA202C}">
-  <ds:schemaRefs>
-    <ds:schemaRef ds:uri="http://schemas.openxmlformats.org/officeDocument/2006/bibliography"/>
-  </ds:schemaRefs>
+<ds:datastoreItem xmlns:ds="http://schemas.openxmlformats.org/officeDocument/2006/customXml" ds:itemID="{9BA7F312-830A-42FC-88BF-400E372AE0CB}">
+  <ds:schemaRefs/>
 </ds:datastoreItem>
 </file>
 
 <file path=customXml/itemProps3.xml><?xml version="1.0" encoding="utf-8"?>
-<ds:datastoreItem xmlns:ds="http://schemas.openxmlformats.org/officeDocument/2006/customXml" ds:itemID="{3F602D96-6183-4CC8-AACB-006A5546A54E}">
-  <ds:schemaRefs>
-    <ds:schemaRef ds:uri="http://schemas.microsoft.com/office/2006/metadata/properties"/>
-    <ds:schemaRef ds:uri="http://schemas.microsoft.com/office/infopath/2007/PartnerControls"/>
-    <ds:schemaRef ds:uri="07c8a24f-8b40-44ca-950f-ae5db2c4fa23"/>
-    <ds:schemaRef ds:uri="71d337dc-809a-4269-a690-d6cd31b4acd0"/>
-  </ds:schemaRefs>
+<ds:datastoreItem xmlns:ds="http://schemas.openxmlformats.org/officeDocument/2006/customXml" ds:itemID="{54814BFD-24A7-4CC8-AE23-C207DFE5A637}">
+  <ds:schemaRefs/>
 </ds:datastoreItem>
 </file>
 
@@ -7321,13 +8096,20 @@
 </file>
 
 <file path=customXml/itemProps5.xml><?xml version="1.0" encoding="utf-8"?>
-<ds:datastoreItem xmlns:ds="http://schemas.openxmlformats.org/officeDocument/2006/customXml" ds:itemID="{54814BFD-24A7-4CC8-AE23-C207DFE5A637}">
-  <ds:schemaRefs/>
+<ds:datastoreItem xmlns:ds="http://schemas.openxmlformats.org/officeDocument/2006/customXml" ds:itemID="{3F602D96-6183-4CC8-AACB-006A5546A54E}">
+  <ds:schemaRefs>
+    <ds:schemaRef ds:uri="http://schemas.microsoft.com/office/2006/metadata/properties"/>
+    <ds:schemaRef ds:uri="http://schemas.microsoft.com/office/infopath/2007/PartnerControls"/>
+    <ds:schemaRef ds:uri="07c8a24f-8b40-44ca-950f-ae5db2c4fa23"/>
+    <ds:schemaRef ds:uri="71d337dc-809a-4269-a690-d6cd31b4acd0"/>
+  </ds:schemaRefs>
 </ds:datastoreItem>
 </file>
 
 <file path=customXml/itemProps6.xml><?xml version="1.0" encoding="utf-8"?>
-<ds:datastoreItem xmlns:ds="http://schemas.openxmlformats.org/officeDocument/2006/customXml" ds:itemID="{9BA7F312-830A-42FC-88BF-400E372AE0CB}">
-  <ds:schemaRefs/>
+<ds:datastoreItem xmlns:ds="http://schemas.openxmlformats.org/officeDocument/2006/customXml" ds:itemID="{DCA57B62-5710-4DF4-8C56-32AF1ABA202C}">
+  <ds:schemaRefs>
+    <ds:schemaRef ds:uri="http://schemas.openxmlformats.org/officeDocument/2006/bibliography"/>
+  </ds:schemaRefs>
 </ds:datastoreItem>
 </file>
</xml_diff>

<commit_message>
Resolve nested documents issue + Update Files
</commit_message>
<xml_diff>
--- a/proposal/BA_MoritzBeyn_firstnotes.docx
+++ b/proposal/BA_MoritzBeyn_firstnotes.docx
@@ -970,21 +970,7 @@
               <w:rFonts w:ascii="Cambria Math" w:eastAsiaTheme="minorEastAsia" w:hAnsi="Cambria Math"/>
               <w:lang w:val="en-US"/>
             </w:rPr>
-            <m:t>ENP</m:t>
-          </m:r>
-          <m:r>
-            <w:rPr>
-              <w:rFonts w:ascii="Cambria Math" w:eastAsiaTheme="minorEastAsia" w:hAnsi="Cambria Math"/>
-              <w:lang w:val="en-US"/>
-            </w:rPr>
-            <m:t>v</m:t>
-          </m:r>
-          <m:r>
-            <w:rPr>
-              <w:rFonts w:ascii="Cambria Math" w:eastAsiaTheme="minorEastAsia" w:hAnsi="Cambria Math"/>
-              <w:lang w:val="en-US"/>
-            </w:rPr>
-            <m:t>=</m:t>
+            <m:t>ENPv=</m:t>
           </m:r>
           <m:f>
             <m:fPr>
@@ -1083,28 +1069,7 @@
               <w:rFonts w:ascii="Cambria Math" w:eastAsiaTheme="minorEastAsia" w:hAnsi="Cambria Math"/>
               <w:lang w:val="en-US"/>
             </w:rPr>
-            <m:t xml:space="preserve">  </m:t>
-          </m:r>
-          <m:r>
-            <w:rPr>
-              <w:rFonts w:ascii="Cambria Math" w:eastAsiaTheme="minorEastAsia" w:hAnsi="Cambria Math"/>
-              <w:lang w:val="en-US"/>
-            </w:rPr>
-            <m:t>ENP</m:t>
-          </m:r>
-          <m:r>
-            <w:rPr>
-              <w:rFonts w:ascii="Cambria Math" w:eastAsiaTheme="minorEastAsia" w:hAnsi="Cambria Math"/>
-              <w:lang w:val="en-US"/>
-            </w:rPr>
-            <m:t>s</m:t>
-          </m:r>
-          <m:r>
-            <w:rPr>
-              <w:rFonts w:ascii="Cambria Math" w:eastAsiaTheme="minorEastAsia" w:hAnsi="Cambria Math"/>
-              <w:lang w:val="en-US"/>
-            </w:rPr>
-            <m:t>=</m:t>
+            <m:t xml:space="preserve">  ENPs=</m:t>
           </m:r>
           <m:f>
             <m:fPr>
@@ -1273,6 +1238,8 @@
         <w:pStyle w:val="StandardohneAbstand"/>
         <w:rPr>
           <w:rFonts w:eastAsiaTheme="minorEastAsia"/>
+          <w:b/>
+          <w:bCs/>
           <w:lang w:val="en-US"/>
         </w:rPr>
       </w:pPr>
@@ -1293,7 +1260,67 @@
           <w:vertAlign w:val="subscript"/>
           <w:lang w:val="en-US"/>
         </w:rPr>
-        <w:t>b</w:t>
+        <w:t>b:</w:t>
+      </w:r>
+      <w:r>
+        <w:rPr>
+          <w:rFonts w:eastAsiaTheme="minorEastAsia"/>
+          <w:b/>
+          <w:bCs/>
+          <w:lang w:val="en-US"/>
+        </w:rPr>
+        <w:t xml:space="preserve">The double </w:t>
+      </w:r>
+      <w:proofErr w:type="spellStart"/>
+      <w:r>
+        <w:rPr>
+          <w:rFonts w:eastAsiaTheme="minorEastAsia"/>
+          <w:b/>
+          <w:bCs/>
+          <w:lang w:val="en-US"/>
+        </w:rPr>
+        <w:t>Pukelsheim</w:t>
+      </w:r>
+      <w:proofErr w:type="spellEnd"/>
+      <w:r>
+        <w:rPr>
+          <w:rFonts w:eastAsiaTheme="minorEastAsia"/>
+          <w:b/>
+          <w:bCs/>
+          <w:lang w:val="en-US"/>
+        </w:rPr>
+        <w:t xml:space="preserve"> system does not mechanically increase parliamentary seat fragmentation compared with the counterfactual Hagenbach-Bischoff allocation.</w:t>
+      </w:r>
+    </w:p>
+    <w:p>
+      <w:pPr>
+        <w:pStyle w:val="StandardohneAbstand"/>
+        <w:rPr>
+          <w:rFonts w:eastAsiaTheme="minorEastAsia"/>
+          <w:b/>
+          <w:bCs/>
+          <w:lang w:val="en-US"/>
+        </w:rPr>
+      </w:pPr>
+    </w:p>
+    <w:p>
+      <w:pPr>
+        <w:pStyle w:val="StandardohneAbstand"/>
+        <w:rPr>
+          <w:rFonts w:eastAsiaTheme="minorEastAsia"/>
+          <w:b/>
+          <w:bCs/>
+          <w:lang w:val="en-US"/>
+        </w:rPr>
+      </w:pPr>
+      <w:r>
+        <w:rPr>
+          <w:rFonts w:eastAsiaTheme="minorEastAsia"/>
+          <w:b/>
+          <w:bCs/>
+          <w:lang w:val="en-US"/>
+        </w:rPr>
+        <w:t>H1₂</w:t>
       </w:r>
       <w:r>
         <w:rPr>
@@ -1303,51 +1330,18 @@
           <w:vertAlign w:val="subscript"/>
           <w:lang w:val="en-US"/>
         </w:rPr>
-        <w:t>:</w:t>
-      </w:r>
-      <w:r>
-        <w:rPr>
-          <w:rFonts w:eastAsiaTheme="minorEastAsia"/>
-          <w:lang w:val="en-US"/>
-        </w:rPr>
-        <w:t xml:space="preserve">The double </w:t>
-      </w:r>
-      <w:proofErr w:type="spellStart"/>
-      <w:r>
-        <w:rPr>
-          <w:rFonts w:eastAsiaTheme="minorEastAsia"/>
-          <w:lang w:val="en-US"/>
-        </w:rPr>
-        <w:t>Pukelsheim</w:t>
-      </w:r>
-      <w:proofErr w:type="spellEnd"/>
-      <w:r>
-        <w:rPr>
-          <w:rFonts w:eastAsiaTheme="minorEastAsia"/>
-          <w:lang w:val="en-US"/>
-        </w:rPr>
-        <w:t xml:space="preserve"> system does not mechanically increase parliamentary seat fragmentation compared with the counterfactual Hagenbach-Bischoff allocation.</w:t>
-      </w:r>
-    </w:p>
-    <w:p>
-      <w:pPr>
-        <w:pStyle w:val="StandardohneAbstand"/>
+        <w:t>b</w:t>
+      </w:r>
+      <w:r>
         <w:rPr>
           <w:rFonts w:eastAsiaTheme="minorEastAsia"/>
           <w:b/>
           <w:bCs/>
           <w:lang w:val="en-US"/>
         </w:rPr>
-      </w:pPr>
-    </w:p>
-    <w:p>
-      <w:pPr>
-        <w:pStyle w:val="StandardohneAbstand"/>
-        <w:rPr>
-          <w:rFonts w:eastAsiaTheme="minorEastAsia"/>
-          <w:lang w:val="en-US"/>
-        </w:rPr>
-      </w:pPr>
+        <w:t xml:space="preserve">:The double </w:t>
+      </w:r>
+      <w:proofErr w:type="spellStart"/>
       <w:r>
         <w:rPr>
           <w:rFonts w:eastAsiaTheme="minorEastAsia"/>
@@ -1355,46 +1349,14 @@
           <w:bCs/>
           <w:lang w:val="en-US"/>
         </w:rPr>
-        <w:t>H1₂</w:t>
-      </w:r>
+        <w:t>Pukelsheim</w:t>
+      </w:r>
+      <w:proofErr w:type="spellEnd"/>
       <w:r>
         <w:rPr>
           <w:rFonts w:eastAsiaTheme="minorEastAsia"/>
           <w:b/>
           <w:bCs/>
-          <w:vertAlign w:val="subscript"/>
-          <w:lang w:val="en-US"/>
-        </w:rPr>
-        <w:t>b</w:t>
-      </w:r>
-      <w:r>
-        <w:rPr>
-          <w:rFonts w:eastAsiaTheme="minorEastAsia"/>
-          <w:b/>
-          <w:bCs/>
-          <w:lang w:val="en-US"/>
-        </w:rPr>
-        <w:t>:</w:t>
-      </w:r>
-      <w:r>
-        <w:rPr>
-          <w:rFonts w:eastAsiaTheme="minorEastAsia"/>
-          <w:lang w:val="en-US"/>
-        </w:rPr>
-        <w:t xml:space="preserve">The double </w:t>
-      </w:r>
-      <w:proofErr w:type="spellStart"/>
-      <w:r>
-        <w:rPr>
-          <w:rFonts w:eastAsiaTheme="minorEastAsia"/>
-          <w:lang w:val="en-US"/>
-        </w:rPr>
-        <w:t>Pukelsheim</w:t>
-      </w:r>
-      <w:proofErr w:type="spellEnd"/>
-      <w:r>
-        <w:rPr>
-          <w:rFonts w:eastAsiaTheme="minorEastAsia"/>
           <w:lang w:val="en-US"/>
         </w:rPr>
         <w:t xml:space="preserve"> system mechanically increases parliamentary seat fragmentation compared with the counterfactual Hagenbach-Bischoff allocation.</w:t>
@@ -1604,13 +1566,7 @@
         <w:rPr>
           <w:lang w:val="en-US"/>
         </w:rPr>
-        <w:t xml:space="preserve"> </w:t>
-      </w:r>
-      <w:r>
-        <w:rPr>
-          <w:lang w:val="en-US"/>
-        </w:rPr>
-        <w:t>(Lüscher,2024,p.135)</w:t>
+        <w:t xml:space="preserve"> (Lüscher,2024,p.135)</w:t>
       </w:r>
       <w:r>
         <w:rPr>
@@ -2522,7 +2478,19 @@
               <w:rPr>
                 <w:lang w:val="en-US"/>
               </w:rPr>
-              <w:t>1 |2022</w:t>
+              <w:t xml:space="preserve">2 </w:t>
+            </w:r>
+            <w:r>
+              <w:rPr>
+                <w:lang w:val="en-US"/>
+              </w:rPr>
+              <w:t>|2022</w:t>
+            </w:r>
+            <w:r>
+              <w:rPr>
+                <w:lang w:val="en-US"/>
+              </w:rPr>
+              <w:t>,2026</w:t>
             </w:r>
           </w:p>
           <w:p>
@@ -2532,12 +2500,6 @@
                 <w:lang w:val="en-US"/>
               </w:rPr>
             </w:pPr>
-            <w:r>
-              <w:rPr>
-                <w:lang w:val="en-US"/>
-              </w:rPr>
-              <w:t>(next 14.6.2026)</w:t>
-            </w:r>
           </w:p>
         </w:tc>
       </w:tr>
@@ -4406,7 +4368,19 @@
         <w:rPr>
           <w:lang w:val="en-US"/>
         </w:rPr>
-        <w:t>For the purposes of this thesis, a smaller party is defined as a party that received at least 10% of the vote share in the relevant electoral unit. Youth lists and other special-interest lists, such as women’s lists or pensioners’ lists, are not treated as independent parties. Instead, their votes and seats are attributed to the respective mother party, which reflects common electoral practice in Switzerland.</w:t>
+        <w:t xml:space="preserve">For the purposes of this thesis, a smaller party is defined as a party that received </w:t>
+      </w:r>
+      <w:r>
+        <w:rPr>
+          <w:lang w:val="en-US"/>
+        </w:rPr>
+        <w:t>in maximum</w:t>
+      </w:r>
+      <w:r>
+        <w:rPr>
+          <w:lang w:val="en-US"/>
+        </w:rPr>
+        <w:t xml:space="preserve"> 10% of the vote share in the relevant electoral unit. Youth lists and other special-interest lists, such as women’s lists or pensioners’ lists, are not treated as independent parties. Instead, their votes and seats are attributed to the respective mother party, which reflects common electoral practice in Switzerland.</w:t>
       </w:r>
     </w:p>
     <w:p>
@@ -4571,12 +4545,12 @@
     <w:p>
       <w:pPr>
         <w:rPr>
-          <w:lang w:val="en-US"/>
-        </w:rPr>
-      </w:pPr>
-      <w:r>
-        <w:rPr>
-          <w:lang w:val="en-US"/>
+          <w:lang w:val="de-CH"/>
+        </w:rPr>
+      </w:pPr>
+      <w:r>
+        <w:rPr>
+          <w:lang w:val="de-CH"/>
         </w:rPr>
         <w:t xml:space="preserve">H2: </w:t>
       </w:r>
@@ -7791,11 +7765,18 @@
 </file>
 
 <file path=customXml/item2.xml><?xml version="1.0" encoding="utf-8"?>
-<TemplafyTemplateConfiguration><![CDATA[{"elementsMetadata":[],"transformationConfigurations":[{"language":"{{UserProfile.DocumentLanguage.Language}}","disableUpdates":false,"type":"proofingLanguage"},{"propertyName":"creator","propertyValue":"{{UserProfile.FirstName}} {{UserProfile.LastName}}","disableUpdates":false,"type":"documentProperty"}],"templateName":"Blank document","templateDescription":"","enableDocumentContentUpdater":true,"version":"2.0"}]]></TemplafyTemplateConfiguration>
+<b:Sources xmlns:b="http://schemas.openxmlformats.org/officeDocument/2006/bibliography" xmlns="http://schemas.openxmlformats.org/officeDocument/2006/bibliography" SelectedStyle="\APASixthEditionOfficeOnline.xsl" StyleName="APA" Version="6"/>
 </file>
 
 <file path=customXml/item3.xml><?xml version="1.0" encoding="utf-8"?>
-<TemplafyFormConfiguration><![CDATA[{"formFields":[],"formDataEntries":[]}]]></TemplafyFormConfiguration>
+<p:properties xmlns:p="http://schemas.microsoft.com/office/2006/metadata/properties" xmlns:xsi="http://www.w3.org/2001/XMLSchema-instance" xmlns:pc="http://schemas.microsoft.com/office/infopath/2007/PartnerControls">
+  <documentManagement>
+    <lcf76f155ced4ddcb4097134ff3c332f xmlns="07c8a24f-8b40-44ca-950f-ae5db2c4fa23">
+      <Terms xmlns="http://schemas.microsoft.com/office/infopath/2007/PartnerControls"/>
+    </lcf76f155ced4ddcb4097134ff3c332f>
+    <TaxCatchAll xmlns="71d337dc-809a-4269-a690-d6cd31b4acd0" xsi:nil="true"/>
+  </documentManagement>
+</p:properties>
 </file>
 
 <file path=customXml/item4.xml><?xml version="1.0" encoding="utf-8"?>
@@ -8042,18 +8023,11 @@
 </file>
 
 <file path=customXml/item5.xml><?xml version="1.0" encoding="utf-8"?>
-<p:properties xmlns:p="http://schemas.microsoft.com/office/2006/metadata/properties" xmlns:xsi="http://www.w3.org/2001/XMLSchema-instance" xmlns:pc="http://schemas.microsoft.com/office/infopath/2007/PartnerControls">
-  <documentManagement>
-    <lcf76f155ced4ddcb4097134ff3c332f xmlns="07c8a24f-8b40-44ca-950f-ae5db2c4fa23">
-      <Terms xmlns="http://schemas.microsoft.com/office/infopath/2007/PartnerControls"/>
-    </lcf76f155ced4ddcb4097134ff3c332f>
-    <TaxCatchAll xmlns="71d337dc-809a-4269-a690-d6cd31b4acd0" xsi:nil="true"/>
-  </documentManagement>
-</p:properties>
+<TemplafyFormConfiguration><![CDATA[{"formFields":[],"formDataEntries":[]}]]></TemplafyFormConfiguration>
 </file>
 
 <file path=customXml/item6.xml><?xml version="1.0" encoding="utf-8"?>
-<b:Sources xmlns:b="http://schemas.openxmlformats.org/officeDocument/2006/bibliography" xmlns="http://schemas.openxmlformats.org/officeDocument/2006/bibliography" SelectedStyle="\APASixthEditionOfficeOnline.xsl" StyleName="APA" Version="6"/>
+<TemplafyTemplateConfiguration><![CDATA[{"elementsMetadata":[],"transformationConfigurations":[{"language":"{{UserProfile.DocumentLanguage.Language}}","disableUpdates":false,"type":"proofingLanguage"},{"propertyName":"creator","propertyValue":"{{UserProfile.FirstName}} {{UserProfile.LastName}}","disableUpdates":false,"type":"documentProperty"}],"templateName":"Blank document","templateDescription":"","enableDocumentContentUpdater":true,"version":"2.0"}]]></TemplafyTemplateConfiguration>
 </file>
 
 <file path=customXml/itemProps1.xml><?xml version="1.0" encoding="utf-8"?>
@@ -8065,14 +8039,21 @@
 </file>
 
 <file path=customXml/itemProps2.xml><?xml version="1.0" encoding="utf-8"?>
-<ds:datastoreItem xmlns:ds="http://schemas.openxmlformats.org/officeDocument/2006/customXml" ds:itemID="{9BA7F312-830A-42FC-88BF-400E372AE0CB}">
-  <ds:schemaRefs/>
+<ds:datastoreItem xmlns:ds="http://schemas.openxmlformats.org/officeDocument/2006/customXml" ds:itemID="{DCA57B62-5710-4DF4-8C56-32AF1ABA202C}">
+  <ds:schemaRefs>
+    <ds:schemaRef ds:uri="http://schemas.openxmlformats.org/officeDocument/2006/bibliography"/>
+  </ds:schemaRefs>
 </ds:datastoreItem>
 </file>
 
 <file path=customXml/itemProps3.xml><?xml version="1.0" encoding="utf-8"?>
-<ds:datastoreItem xmlns:ds="http://schemas.openxmlformats.org/officeDocument/2006/customXml" ds:itemID="{54814BFD-24A7-4CC8-AE23-C207DFE5A637}">
-  <ds:schemaRefs/>
+<ds:datastoreItem xmlns:ds="http://schemas.openxmlformats.org/officeDocument/2006/customXml" ds:itemID="{3F602D96-6183-4CC8-AACB-006A5546A54E}">
+  <ds:schemaRefs>
+    <ds:schemaRef ds:uri="http://schemas.microsoft.com/office/2006/metadata/properties"/>
+    <ds:schemaRef ds:uri="http://schemas.microsoft.com/office/infopath/2007/PartnerControls"/>
+    <ds:schemaRef ds:uri="07c8a24f-8b40-44ca-950f-ae5db2c4fa23"/>
+    <ds:schemaRef ds:uri="71d337dc-809a-4269-a690-d6cd31b4acd0"/>
+  </ds:schemaRefs>
 </ds:datastoreItem>
 </file>
 
@@ -8096,20 +8077,13 @@
 </file>
 
 <file path=customXml/itemProps5.xml><?xml version="1.0" encoding="utf-8"?>
-<ds:datastoreItem xmlns:ds="http://schemas.openxmlformats.org/officeDocument/2006/customXml" ds:itemID="{3F602D96-6183-4CC8-AACB-006A5546A54E}">
-  <ds:schemaRefs>
-    <ds:schemaRef ds:uri="http://schemas.microsoft.com/office/2006/metadata/properties"/>
-    <ds:schemaRef ds:uri="http://schemas.microsoft.com/office/infopath/2007/PartnerControls"/>
-    <ds:schemaRef ds:uri="07c8a24f-8b40-44ca-950f-ae5db2c4fa23"/>
-    <ds:schemaRef ds:uri="71d337dc-809a-4269-a690-d6cd31b4acd0"/>
-  </ds:schemaRefs>
+<ds:datastoreItem xmlns:ds="http://schemas.openxmlformats.org/officeDocument/2006/customXml" ds:itemID="{54814BFD-24A7-4CC8-AE23-C207DFE5A637}">
+  <ds:schemaRefs/>
 </ds:datastoreItem>
 </file>
 
 <file path=customXml/itemProps6.xml><?xml version="1.0" encoding="utf-8"?>
-<ds:datastoreItem xmlns:ds="http://schemas.openxmlformats.org/officeDocument/2006/customXml" ds:itemID="{DCA57B62-5710-4DF4-8C56-32AF1ABA202C}">
-  <ds:schemaRefs>
-    <ds:schemaRef ds:uri="http://schemas.openxmlformats.org/officeDocument/2006/bibliography"/>
-  </ds:schemaRefs>
+<ds:datastoreItem xmlns:ds="http://schemas.openxmlformats.org/officeDocument/2006/customXml" ds:itemID="{9BA7F312-830A-42FC-88BF-400E372AE0CB}">
+  <ds:schemaRefs/>
 </ds:datastoreItem>
 </file>
</xml_diff>